<commit_message>
feat: AvisoSistemaWidget post-it flutuante (draggable, criticidade baixa/media/alta, prazo/permanente, origem admin/diretoria); AdminTab aba Avisos CRUD; CrmTab area livre contenteditable; CrmTab split modal 9 abas; docs: Manual Word cap├¡tulos 30-31 (Avisos + CRM Modal/├ürea Livre); PPTX 4 novos slides (slides 35-38)
</commit_message>
<xml_diff>
--- a/Manual_ACN_Sinal_Verde.docx
+++ b/Manual_ACN_Sinal_Verde.docx
@@ -11787,6 +11787,1173 @@
         </w:rPr>
         <w:t xml:space="preserve">ACN Sinal Verde  ·  Manual do Usuário  ·  Versão 2025</w:t>
       </w:r>
+    </w:p>
+    <w:p>
+      <w:pPr>
+        <w:pStyle w:val="1"/>
+        <w:spacing w:after="160" w:before="300"/>
+      </w:pPr>
+      <w:r>
+        <w:rPr>
+          <w:rFonts w:ascii="Calibri" w:cs="Calibri" w:eastAsia="Calibri" w:hAnsi="Calibri"/>
+          <w:b/>
+          <w:bCs/>
+          <w:color w:val="1E3A5F"/>
+          <w:sz w:val="36"/>
+          <w:szCs w:val="36"/>
+        </w:rPr>
+        <w:t xml:space="preserve">30. Avisos do Sistema</w:t>
+      </w:r>
+    </w:p>
+    <w:p>
+      <w:pPr>
+        <w:spacing w:after="80" w:before="60"/>
+        <w:jc w:val="both"/>
+      </w:pPr>
+      <w:r>
+        <w:rPr>
+          <w:rFonts w:ascii="Calibri" w:cs="Calibri" w:eastAsia="Calibri" w:hAnsi="Calibri"/>
+          <w:color w:val="1E293B"/>
+          <w:sz w:val="22"/>
+          <w:szCs w:val="22"/>
+        </w:rPr>
+        <w:t xml:space="preserve">O módulo de Avisos do Sistema permite que usuários autorizados publiquem mensagens críticas que aparecem automaticamente para todos os colaboradores logados, na forma de um post-it flutuante visível em qualquer aba do sistema.</w:t>
+      </w:r>
+    </w:p>
+    <w:p>
+      <w:pPr>
+        <w:spacing w:after="80" w:before="200"/>
+      </w:pPr>
+      <w:r>
+        <w:rPr>
+          <w:rFonts w:ascii="Calibri" w:cs="Calibri" w:eastAsia="Calibri" w:hAnsi="Calibri"/>
+          <w:b/>
+          <w:bCs/>
+          <w:color w:val="0369A1"/>
+          <w:sz w:val="24"/>
+          <w:szCs w:val="24"/>
+        </w:rPr>
+        <w:t xml:space="preserve">30.1 Widget Post-it Flutuante</w:t>
+      </w:r>
+    </w:p>
+    <w:p>
+      <w:pPr>
+        <w:spacing w:after="80" w:before="60"/>
+        <w:jc w:val="both"/>
+      </w:pPr>
+      <w:r>
+        <w:rPr>
+          <w:rFonts w:ascii="Calibri" w:cs="Calibri" w:eastAsia="Calibri" w:hAnsi="Calibri"/>
+          <w:color w:val="1E293B"/>
+          <w:sz w:val="22"/>
+          <w:szCs w:val="22"/>
+        </w:rPr>
+        <w:t xml:space="preserve">O widget aparece fixado no canto superior direito da tela, por cima de qualquer conteúdo. Ele é arrastável: clique e segure o cabeçalho escuro e arraste para reposicioná-lo livremente na tela.</w:t>
+      </w:r>
+    </w:p>
+    <w:p>
+      <w:pPr>
+        <w:spacing w:after="80" w:before="60"/>
+        <w:jc w:val="both"/>
+      </w:pPr>
+      <w:r>
+        <w:rPr>
+          <w:rFonts w:ascii="Calibri" w:cs="Calibri" w:eastAsia="Calibri" w:hAnsi="Calibri"/>
+          <w:color w:val="1E293B"/>
+          <w:sz w:val="22"/>
+          <w:szCs w:val="22"/>
+        </w:rPr>
+        <w:t xml:space="preserve">O widget possui dois estados:</w:t>
+      </w:r>
+    </w:p>
+    <w:p>
+      <w:pPr>
+        <w:numPr>
+          <w:ilvl w:val="0"/>
+          <w:numId w:val="1"/>
+        </w:numPr>
+        <w:spacing w:after="40" w:before="40"/>
+      </w:pPr>
+      <w:r>
+        <w:rPr>
+          <w:rFonts w:ascii="Calibri" w:cs="Calibri" w:eastAsia="Calibri" w:hAnsi="Calibri"/>
+          <w:color w:val="1E293B"/>
+          <w:sz w:val="22"/>
+          <w:szCs w:val="22"/>
+        </w:rPr>
+        <w:t xml:space="preserve">Expandido: exibe todos os avisos ativos empilhados como cards coloridos.</w:t>
+      </w:r>
+    </w:p>
+    <w:p>
+      <w:pPr>
+        <w:numPr>
+          <w:ilvl w:val="0"/>
+          <w:numId w:val="1"/>
+        </w:numPr>
+        <w:spacing w:after="40" w:before="40"/>
+      </w:pPr>
+      <w:r>
+        <w:rPr>
+          <w:rFonts w:ascii="Calibri" w:cs="Calibri" w:eastAsia="Calibri" w:hAnsi="Calibri"/>
+          <w:color w:val="1E293B"/>
+          <w:sz w:val="22"/>
+          <w:szCs w:val="22"/>
+        </w:rPr>
+        <w:t xml:space="preserve">Minimizado: colapsa em um ícone circular 📌 com um contador de avisos. Avisos de criticidade ALTA pulsam continuamente para chamar atenção.</w:t>
+      </w:r>
+    </w:p>
+    <w:p>
+      <w:pPr>
+        <w:spacing w:after="80" w:before="60"/>
+        <w:jc w:val="both"/>
+      </w:pPr>
+      <w:r>
+        <w:rPr>
+          <w:rFonts w:ascii="Calibri" w:cs="Calibri" w:eastAsia="Calibri" w:hAnsi="Calibri"/>
+          <w:color w:val="1E293B"/>
+          <w:sz w:val="22"/>
+          <w:szCs w:val="22"/>
+        </w:rPr>
+        <w:t xml:space="preserve">Os avisos são atualizados em tempo real via Supabase Realtime: ao ser publicado por qualquer usuário com permissão, o aviso aparece instantaneamente para todos os colaboradores sem necessidade de recarregar a página.</w:t>
+      </w:r>
+    </w:p>
+    <w:p>
+      <w:pPr>
+        <w:spacing w:after="80" w:before="200"/>
+      </w:pPr>
+      <w:r>
+        <w:rPr>
+          <w:rFonts w:ascii="Calibri" w:cs="Calibri" w:eastAsia="Calibri" w:hAnsi="Calibri"/>
+          <w:b/>
+          <w:bCs/>
+          <w:color w:val="0369A1"/>
+          <w:sz w:val="24"/>
+          <w:szCs w:val="24"/>
+        </w:rPr>
+        <w:t xml:space="preserve">30.2 Níveis de Criticidade</w:t>
+      </w:r>
+    </w:p>
+    <w:p>
+      <w:pPr>
+        <w:spacing w:after="80" w:before="60"/>
+        <w:jc w:val="both"/>
+      </w:pPr>
+      <w:r>
+        <w:rPr>
+          <w:rFonts w:ascii="Calibri" w:cs="Calibri" w:eastAsia="Calibri" w:hAnsi="Calibri"/>
+          <w:color w:val="1E293B"/>
+          <w:sz w:val="22"/>
+          <w:szCs w:val="22"/>
+        </w:rPr>
+        <w:t xml:space="preserve">Cada aviso tem um nível de criticidade que define a cor do card:</w:t>
+      </w:r>
+    </w:p>
+    <w:p>
+      <w:pPr>
+        <w:numPr>
+          <w:ilvl w:val="0"/>
+          <w:numId w:val="1"/>
+        </w:numPr>
+        <w:spacing w:after="40" w:before="40"/>
+      </w:pPr>
+      <w:r>
+        <w:rPr>
+          <w:rFonts w:ascii="Calibri" w:cs="Calibri" w:eastAsia="Calibri" w:hAnsi="Calibri"/>
+          <w:color w:val="1E293B"/>
+          <w:sz w:val="22"/>
+          <w:szCs w:val="22"/>
+        </w:rPr>
+        <w:t xml:space="preserve">🟡 Baixa — fundo amarelo. Informações gerais, avisos de rotina.</w:t>
+      </w:r>
+    </w:p>
+    <w:p>
+      <w:pPr>
+        <w:numPr>
+          <w:ilvl w:val="0"/>
+          <w:numId w:val="1"/>
+        </w:numPr>
+        <w:spacing w:after="40" w:before="40"/>
+      </w:pPr>
+      <w:r>
+        <w:rPr>
+          <w:rFonts w:ascii="Calibri" w:cs="Calibri" w:eastAsia="Calibri" w:hAnsi="Calibri"/>
+          <w:color w:val="1E293B"/>
+          <w:sz w:val="22"/>
+          <w:szCs w:val="22"/>
+        </w:rPr>
+        <w:t xml:space="preserve">🟠 Média — fundo laranja. Atenção necessária, prazos importantes.</w:t>
+      </w:r>
+    </w:p>
+    <w:p>
+      <w:pPr>
+        <w:numPr>
+          <w:ilvl w:val="0"/>
+          <w:numId w:val="1"/>
+        </w:numPr>
+        <w:spacing w:after="40" w:before="40"/>
+      </w:pPr>
+      <w:r>
+        <w:rPr>
+          <w:rFonts w:ascii="Calibri" w:cs="Calibri" w:eastAsia="Calibri" w:hAnsi="Calibri"/>
+          <w:color w:val="1E293B"/>
+          <w:sz w:val="22"/>
+          <w:szCs w:val="22"/>
+        </w:rPr>
+        <w:t xml:space="preserve">🔴 Alta — fundo vermelho. Urgente. O ícone minimizado pulsa.</w:t>
+      </w:r>
+    </w:p>
+    <w:p>
+      <w:pPr>
+        <w:spacing w:after="80" w:before="200"/>
+      </w:pPr>
+      <w:r>
+        <w:rPr>
+          <w:rFonts w:ascii="Calibri" w:cs="Calibri" w:eastAsia="Calibri" w:hAnsi="Calibri"/>
+          <w:b/>
+          <w:bCs/>
+          <w:color w:val="0369A1"/>
+          <w:sz w:val="24"/>
+          <w:szCs w:val="24"/>
+        </w:rPr>
+        <w:t xml:space="preserve">30.3 Origem do Aviso</w:t>
+      </w:r>
+    </w:p>
+    <w:p>
+      <w:pPr>
+        <w:spacing w:after="80" w:before="60"/>
+        <w:jc w:val="both"/>
+      </w:pPr>
+      <w:r>
+        <w:rPr>
+          <w:rFonts w:ascii="Calibri" w:cs="Calibri" w:eastAsia="Calibri" w:hAnsi="Calibri"/>
+          <w:color w:val="1E293B"/>
+          <w:sz w:val="22"/>
+          <w:szCs w:val="22"/>
+        </w:rPr>
+        <w:t xml:space="preserve">Todo aviso exibe um badge indicando sua origem:</w:t>
+      </w:r>
+    </w:p>
+    <w:p>
+      <w:pPr>
+        <w:numPr>
+          <w:ilvl w:val="0"/>
+          <w:numId w:val="1"/>
+        </w:numPr>
+        <w:spacing w:after="40" w:before="40"/>
+      </w:pPr>
+      <w:r>
+        <w:rPr>
+          <w:rFonts w:ascii="Calibri" w:cs="Calibri" w:eastAsia="Calibri" w:hAnsi="Calibri"/>
+          <w:color w:val="1E293B"/>
+          <w:sz w:val="22"/>
+          <w:szCs w:val="22"/>
+        </w:rPr>
+        <w:t xml:space="preserve">👮 Admin — comunicados operacionais e de TI.</w:t>
+      </w:r>
+    </w:p>
+    <w:p>
+      <w:pPr>
+        <w:numPr>
+          <w:ilvl w:val="0"/>
+          <w:numId w:val="1"/>
+        </w:numPr>
+        <w:spacing w:after="40" w:before="40"/>
+      </w:pPr>
+      <w:r>
+        <w:rPr>
+          <w:rFonts w:ascii="Calibri" w:cs="Calibri" w:eastAsia="Calibri" w:hAnsi="Calibri"/>
+          <w:color w:val="1E293B"/>
+          <w:sz w:val="22"/>
+          <w:szCs w:val="22"/>
+        </w:rPr>
+        <w:t xml:space="preserve">🏢 Diretoria — comunicados estratégicos e institucionais.</w:t>
+      </w:r>
+    </w:p>
+    <w:p>
+      <w:pPr>
+        <w:spacing w:after="80" w:before="200"/>
+      </w:pPr>
+      <w:r>
+        <w:rPr>
+          <w:rFonts w:ascii="Calibri" w:cs="Calibri" w:eastAsia="Calibri" w:hAnsi="Calibri"/>
+          <w:b/>
+          <w:bCs/>
+          <w:color w:val="0369A1"/>
+          <w:sz w:val="24"/>
+          <w:szCs w:val="24"/>
+        </w:rPr>
+        <w:t xml:space="preserve">30.4 Prazo de Exibição</w:t>
+      </w:r>
+    </w:p>
+    <w:p>
+      <w:pPr>
+        <w:spacing w:after="80" w:before="60"/>
+        <w:jc w:val="both"/>
+      </w:pPr>
+      <w:r>
+        <w:rPr>
+          <w:rFonts w:ascii="Calibri" w:cs="Calibri" w:eastAsia="Calibri" w:hAnsi="Calibri"/>
+          <w:color w:val="1E293B"/>
+          <w:sz w:val="22"/>
+          <w:szCs w:val="22"/>
+        </w:rPr>
+        <w:t xml:space="preserve">Ao criar um aviso, o publicador define por quanto tempo ele ficará visível:</w:t>
+      </w:r>
+    </w:p>
+    <w:p>
+      <w:pPr>
+        <w:numPr>
+          <w:ilvl w:val="0"/>
+          <w:numId w:val="1"/>
+        </w:numPr>
+        <w:spacing w:after="40" w:before="40"/>
+      </w:pPr>
+      <w:r>
+        <w:rPr>
+          <w:rFonts w:ascii="Calibri" w:cs="Calibri" w:eastAsia="Calibri" w:hAnsi="Calibri"/>
+          <w:color w:val="1E293B"/>
+          <w:sz w:val="22"/>
+          <w:szCs w:val="22"/>
+        </w:rPr>
+        <w:t xml:space="preserve">📌 Permanente — o aviso permanece ativo até ser manualmente desativado ou excluído.</w:t>
+      </w:r>
+    </w:p>
+    <w:p>
+      <w:pPr>
+        <w:numPr>
+          <w:ilvl w:val="0"/>
+          <w:numId w:val="1"/>
+        </w:numPr>
+        <w:spacing w:after="40" w:before="40"/>
+      </w:pPr>
+      <w:r>
+        <w:rPr>
+          <w:rFonts w:ascii="Calibri" w:cs="Calibri" w:eastAsia="Calibri" w:hAnsi="Calibri"/>
+          <w:color w:val="1E293B"/>
+          <w:sz w:val="22"/>
+          <w:szCs w:val="22"/>
+        </w:rPr>
+        <w:t xml:space="preserve">⏱ Válido até — o aviso desaparece automaticamente após a data e hora informadas.</w:t>
+      </w:r>
+    </w:p>
+    <w:p>
+      <w:pPr>
+        <w:pBdr>
+          <w:left w:val="thick" w:color="F59E0B" w:sz="12"/>
+        </w:pBdr>
+        <w:shd w:fill="FFFBEB" w:val="clear"/>
+        <w:spacing w:after="60" w:before="60"/>
+        <w:ind w:left="180"/>
+      </w:pPr>
+      <w:r>
+        <w:rPr>
+          <w:rFonts w:ascii="Calibri" w:cs="Calibri" w:eastAsia="Calibri" w:hAnsi="Calibri"/>
+          <w:i/>
+          <w:iCs/>
+          <w:color w:val="92400E"/>
+          <w:sz w:val="20"/>
+          <w:szCs w:val="20"/>
+        </w:rPr>
+        <w:t xml:space="preserve">⚠ Nota: Avisos expirados somem do widget mas podem ser consultados em Admin &gt; Avisos com o filtro "Expirados".</w:t>
+      </w:r>
+    </w:p>
+    <w:p>
+      <w:pPr>
+        <w:spacing w:after="80" w:before="200"/>
+      </w:pPr>
+      <w:r>
+        <w:rPr>
+          <w:rFonts w:ascii="Calibri" w:cs="Calibri" w:eastAsia="Calibri" w:hAnsi="Calibri"/>
+          <w:b/>
+          <w:bCs/>
+          <w:color w:val="0369A1"/>
+          <w:sz w:val="24"/>
+          <w:szCs w:val="24"/>
+        </w:rPr>
+        <w:t xml:space="preserve">30.5 Publicar um Aviso pelo Widget</w:t>
+      </w:r>
+    </w:p>
+    <w:p>
+      <w:pPr>
+        <w:spacing w:after="80" w:before="60"/>
+        <w:jc w:val="both"/>
+      </w:pPr>
+      <w:r>
+        <w:rPr>
+          <w:rFonts w:ascii="Calibri" w:cs="Calibri" w:eastAsia="Calibri" w:hAnsi="Calibri"/>
+          <w:color w:val="1E293B"/>
+          <w:sz w:val="22"/>
+          <w:szCs w:val="22"/>
+        </w:rPr>
+        <w:t xml:space="preserve">Usuários com a permissão "📢 Pode publicar Avisos do Sistema" veem um botão verde + no cabeçalho do widget. Ao clicar:</w:t>
+      </w:r>
+    </w:p>
+    <w:p>
+      <w:pPr>
+        <w:numPr>
+          <w:ilvl w:val="0"/>
+          <w:numId w:val="1"/>
+        </w:numPr>
+        <w:spacing w:after="40" w:before="40"/>
+      </w:pPr>
+      <w:r>
+        <w:rPr>
+          <w:rFonts w:ascii="Calibri" w:cs="Calibri" w:eastAsia="Calibri" w:hAnsi="Calibri"/>
+          <w:color w:val="1E293B"/>
+          <w:sz w:val="22"/>
+          <w:szCs w:val="22"/>
+        </w:rPr>
+        <w:t xml:space="preserve">Um formulário compacto abre dentro do próprio widget (fundo escuro).</w:t>
+      </w:r>
+    </w:p>
+    <w:p>
+      <w:pPr>
+        <w:numPr>
+          <w:ilvl w:val="0"/>
+          <w:numId w:val="1"/>
+        </w:numPr>
+        <w:spacing w:after="40" w:before="40"/>
+      </w:pPr>
+      <w:r>
+        <w:rPr>
+          <w:rFonts w:ascii="Calibri" w:cs="Calibri" w:eastAsia="Calibri" w:hAnsi="Calibri"/>
+          <w:color w:val="1E293B"/>
+          <w:sz w:val="22"/>
+          <w:szCs w:val="22"/>
+        </w:rPr>
+        <w:t xml:space="preserve">Preencha: Título, Mensagem, Origem (Admin / Diretoria), Criticidade e prazo.</w:t>
+      </w:r>
+    </w:p>
+    <w:p>
+      <w:pPr>
+        <w:numPr>
+          <w:ilvl w:val="0"/>
+          <w:numId w:val="1"/>
+        </w:numPr>
+        <w:spacing w:after="40" w:before="40"/>
+      </w:pPr>
+      <w:r>
+        <w:rPr>
+          <w:rFonts w:ascii="Calibri" w:cs="Calibri" w:eastAsia="Calibri" w:hAnsi="Calibri"/>
+          <w:color w:val="1E293B"/>
+          <w:sz w:val="22"/>
+          <w:szCs w:val="22"/>
+        </w:rPr>
+        <w:t xml:space="preserve">Clique em 📢 Publicar Aviso. O aviso aparece instantaneamente para todos.</w:t>
+      </w:r>
+    </w:p>
+    <w:p>
+      <w:pPr>
+        <w:pBdr>
+          <w:left w:val="thick" w:color="22C55E" w:sz="12"/>
+        </w:pBdr>
+        <w:shd w:fill="F0FDF4" w:val="clear"/>
+        <w:spacing w:after="60" w:before="60"/>
+        <w:ind w:left="180"/>
+      </w:pPr>
+      <w:r>
+        <w:rPr>
+          <w:rFonts w:ascii="Calibri" w:cs="Calibri" w:eastAsia="Calibri" w:hAnsi="Calibri"/>
+          <w:i/>
+          <w:iCs/>
+          <w:color w:val="166534"/>
+          <w:sz w:val="20"/>
+          <w:szCs w:val="20"/>
+        </w:rPr>
+        <w:t xml:space="preserve">💡 Dica: O botão + só aparece para usuários com a permissão habilitada. O Admin ativa essa permissão em Admin &gt; Usuários &gt; editar usuário &gt; "Pode publicar Avisos do Sistema".</w:t>
+      </w:r>
+    </w:p>
+    <w:p>
+      <w:pPr>
+        <w:spacing w:after="80" w:before="200"/>
+      </w:pPr>
+      <w:r>
+        <w:rPr>
+          <w:rFonts w:ascii="Calibri" w:cs="Calibri" w:eastAsia="Calibri" w:hAnsi="Calibri"/>
+          <w:b/>
+          <w:bCs/>
+          <w:color w:val="0369A1"/>
+          <w:sz w:val="24"/>
+          <w:szCs w:val="24"/>
+        </w:rPr>
+        <w:t xml:space="preserve">30.6 Gerenciamento de Avisos (Admin &gt; Avisos)</w:t>
+      </w:r>
+    </w:p>
+    <w:p>
+      <w:pPr>
+        <w:spacing w:after="80" w:before="60"/>
+        <w:jc w:val="both"/>
+      </w:pPr>
+      <w:r>
+        <w:rPr>
+          <w:rFonts w:ascii="Calibri" w:cs="Calibri" w:eastAsia="Calibri" w:hAnsi="Calibri"/>
+          <w:color w:val="1E293B"/>
+          <w:sz w:val="22"/>
+          <w:szCs w:val="22"/>
+        </w:rPr>
+        <w:t xml:space="preserve">Usuários com permissão e Admins acessam a gestão completa em Admin &gt; aba 📢 Avisos:</w:t>
+      </w:r>
+    </w:p>
+    <w:p>
+      <w:pPr>
+        <w:numPr>
+          <w:ilvl w:val="0"/>
+          <w:numId w:val="1"/>
+        </w:numPr>
+        <w:spacing w:after="40" w:before="40"/>
+      </w:pPr>
+      <w:r>
+        <w:rPr>
+          <w:rFonts w:ascii="Calibri" w:cs="Calibri" w:eastAsia="Calibri" w:hAnsi="Calibri"/>
+          <w:color w:val="1E293B"/>
+          <w:sz w:val="22"/>
+          <w:szCs w:val="22"/>
+        </w:rPr>
+        <w:t xml:space="preserve">Criar novo aviso com todos os parâmetros.</w:t>
+      </w:r>
+    </w:p>
+    <w:p>
+      <w:pPr>
+        <w:numPr>
+          <w:ilvl w:val="0"/>
+          <w:numId w:val="1"/>
+        </w:numPr>
+        <w:spacing w:after="40" w:before="40"/>
+      </w:pPr>
+      <w:r>
+        <w:rPr>
+          <w:rFonts w:ascii="Calibri" w:cs="Calibri" w:eastAsia="Calibri" w:hAnsi="Calibri"/>
+          <w:color w:val="1E293B"/>
+          <w:sz w:val="22"/>
+          <w:szCs w:val="22"/>
+        </w:rPr>
+        <w:t xml:space="preserve">Editar avisos existentes (✏️).</w:t>
+      </w:r>
+    </w:p>
+    <w:p>
+      <w:pPr>
+        <w:numPr>
+          <w:ilvl w:val="0"/>
+          <w:numId w:val="1"/>
+        </w:numPr>
+        <w:spacing w:after="40" w:before="40"/>
+      </w:pPr>
+      <w:r>
+        <w:rPr>
+          <w:rFonts w:ascii="Calibri" w:cs="Calibri" w:eastAsia="Calibri" w:hAnsi="Calibri"/>
+          <w:color w:val="1E293B"/>
+          <w:sz w:val="22"/>
+          <w:szCs w:val="22"/>
+        </w:rPr>
+        <w:t xml:space="preserve">Ativar / Desativar aviso sem excluir (⏸ / ▶️) — útil para avisos recorrentes.</w:t>
+      </w:r>
+    </w:p>
+    <w:p>
+      <w:pPr>
+        <w:numPr>
+          <w:ilvl w:val="0"/>
+          <w:numId w:val="1"/>
+        </w:numPr>
+        <w:spacing w:after="40" w:before="40"/>
+      </w:pPr>
+      <w:r>
+        <w:rPr>
+          <w:rFonts w:ascii="Calibri" w:cs="Calibri" w:eastAsia="Calibri" w:hAnsi="Calibri"/>
+          <w:color w:val="1E293B"/>
+          <w:sz w:val="22"/>
+          <w:szCs w:val="22"/>
+        </w:rPr>
+        <w:t xml:space="preserve">Excluir aviso permanentemente (🗑).</w:t>
+      </w:r>
+    </w:p>
+    <w:p>
+      <w:pPr>
+        <w:numPr>
+          <w:ilvl w:val="0"/>
+          <w:numId w:val="1"/>
+        </w:numPr>
+        <w:spacing w:after="40" w:before="40"/>
+      </w:pPr>
+      <w:r>
+        <w:rPr>
+          <w:rFonts w:ascii="Calibri" w:cs="Calibri" w:eastAsia="Calibri" w:hAnsi="Calibri"/>
+          <w:color w:val="1E293B"/>
+          <w:sz w:val="22"/>
+          <w:szCs w:val="22"/>
+        </w:rPr>
+        <w:t xml:space="preserve">Filtrar por: ✅ Ativos · 📋 Todos · ⏰ Expirados.</w:t>
+      </w:r>
+    </w:p>
+    <w:p>
+      <w:pPr>
+        <w:pBdr>
+          <w:left w:val="thick" w:color="F59E0B" w:sz="12"/>
+        </w:pBdr>
+        <w:shd w:fill="FFFBEB" w:val="clear"/>
+        <w:spacing w:after="60" w:before="60"/>
+        <w:ind w:left="180"/>
+      </w:pPr>
+      <w:r>
+        <w:rPr>
+          <w:rFonts w:ascii="Calibri" w:cs="Calibri" w:eastAsia="Calibri" w:hAnsi="Calibri"/>
+          <w:i/>
+          <w:iCs/>
+          <w:color w:val="92400E"/>
+          <w:sz w:val="20"/>
+          <w:szCs w:val="20"/>
+        </w:rPr>
+        <w:t xml:space="preserve">⚠ Nota: Somente usuários com a permissão "📢 Pode publicar Avisos do Sistema" (ou perfil Admin) veem o formulário de criação e os botões de ação. Outros usuários veem apenas a lista de avisos existentes.</w:t>
+      </w:r>
+    </w:p>
+    <w:p>
+      <w:pPr>
+        <w:spacing w:after="60" w:before="0"/>
+      </w:pPr>
+    </w:p>
+    <w:p>
+      <w:pPr>
+        <w:pStyle w:val="1"/>
+        <w:spacing w:after="160" w:before="300"/>
+      </w:pPr>
+      <w:r>
+        <w:rPr>
+          <w:rFonts w:ascii="Calibri" w:cs="Calibri" w:eastAsia="Calibri" w:hAnsi="Calibri"/>
+          <w:b/>
+          <w:bCs/>
+          <w:color w:val="1E3A5F"/>
+          <w:sz w:val="36"/>
+          <w:szCs w:val="36"/>
+        </w:rPr>
+        <w:t xml:space="preserve">31. CRM — Modal de Abertura e Área Livre</w:t>
+      </w:r>
+    </w:p>
+    <w:p>
+      <w:pPr>
+        <w:spacing w:after="80" w:before="60"/>
+        <w:jc w:val="both"/>
+      </w:pPr>
+      <w:r>
+        <w:rPr>
+          <w:rFonts w:ascii="Calibri" w:cs="Calibri" w:eastAsia="Calibri" w:hAnsi="Calibri"/>
+          <w:color w:val="1E293B"/>
+          <w:sz w:val="22"/>
+          <w:szCs w:val="22"/>
+        </w:rPr>
+        <w:t xml:space="preserve">Os cards do CRM (Licitações e Vendas Diretas) possuem um modal de tela cheia dividido em dois painéis, acessado pelo botão 📂 Abrir. Esse modal centraliza todos os dados e documentos de uma oportunidade em um único lugar.</w:t>
+      </w:r>
+    </w:p>
+    <w:p>
+      <w:pPr>
+        <w:spacing w:after="80" w:before="200"/>
+      </w:pPr>
+      <w:r>
+        <w:rPr>
+          <w:rFonts w:ascii="Calibri" w:cs="Calibri" w:eastAsia="Calibri" w:hAnsi="Calibri"/>
+          <w:b/>
+          <w:bCs/>
+          <w:color w:val="0369A1"/>
+          <w:sz w:val="24"/>
+          <w:szCs w:val="24"/>
+        </w:rPr>
+        <w:t xml:space="preserve">31.1 Botão 📂 Abrir nos Cards</w:t>
+      </w:r>
+    </w:p>
+    <w:p>
+      <w:pPr>
+        <w:spacing w:after="80" w:before="60"/>
+        <w:jc w:val="both"/>
+      </w:pPr>
+      <w:r>
+        <w:rPr>
+          <w:rFonts w:ascii="Calibri" w:cs="Calibri" w:eastAsia="Calibri" w:hAnsi="Calibri"/>
+          <w:color w:val="1E293B"/>
+          <w:sz w:val="22"/>
+          <w:szCs w:val="22"/>
+        </w:rPr>
+        <w:t xml:space="preserve">Nos cards do kanban CRM, o botão 📂 Abrir substitui o antigo botão ✏️ Editar. Ele está disponível para oportunidades que não estejam marcadas como Perdidas ou Desistência.</w:t>
+      </w:r>
+    </w:p>
+    <w:p>
+      <w:pPr>
+        <w:spacing w:after="80" w:before="200"/>
+      </w:pPr>
+      <w:r>
+        <w:rPr>
+          <w:rFonts w:ascii="Calibri" w:cs="Calibri" w:eastAsia="Calibri" w:hAnsi="Calibri"/>
+          <w:b/>
+          <w:bCs/>
+          <w:color w:val="0369A1"/>
+          <w:sz w:val="24"/>
+          <w:szCs w:val="24"/>
+        </w:rPr>
+        <w:t xml:space="preserve">31.2 Painel Esquerdo — Formulário de Dados</w:t>
+      </w:r>
+    </w:p>
+    <w:p>
+      <w:pPr>
+        <w:spacing w:after="80" w:before="60"/>
+        <w:jc w:val="both"/>
+      </w:pPr>
+      <w:r>
+        <w:rPr>
+          <w:rFonts w:ascii="Calibri" w:cs="Calibri" w:eastAsia="Calibri" w:hAnsi="Calibri"/>
+          <w:color w:val="1E293B"/>
+          <w:sz w:val="22"/>
+          <w:szCs w:val="22"/>
+        </w:rPr>
+        <w:t xml:space="preserve">Ocupa 42% da tela. Contém todos os campos editáveis da oportunidade:</w:t>
+      </w:r>
+    </w:p>
+    <w:p>
+      <w:pPr>
+        <w:numPr>
+          <w:ilvl w:val="0"/>
+          <w:numId w:val="1"/>
+        </w:numPr>
+        <w:spacing w:after="40" w:before="40"/>
+      </w:pPr>
+      <w:r>
+        <w:rPr>
+          <w:rFonts w:ascii="Calibri" w:cs="Calibri" w:eastAsia="Calibri" w:hAnsi="Calibri"/>
+          <w:color w:val="1E293B"/>
+          <w:sz w:val="22"/>
+          <w:szCs w:val="22"/>
+        </w:rPr>
+        <w:t xml:space="preserve">Título, Tipo de Licitação, Número do Edital, Órgão.</w:t>
+      </w:r>
+    </w:p>
+    <w:p>
+      <w:pPr>
+        <w:numPr>
+          <w:ilvl w:val="0"/>
+          <w:numId w:val="1"/>
+        </w:numPr>
+        <w:spacing w:after="40" w:before="40"/>
+      </w:pPr>
+      <w:r>
+        <w:rPr>
+          <w:rFonts w:ascii="Calibri" w:cs="Calibri" w:eastAsia="Calibri" w:hAnsi="Calibri"/>
+          <w:color w:val="1E293B"/>
+          <w:sz w:val="22"/>
+          <w:szCs w:val="22"/>
+        </w:rPr>
+        <w:t xml:space="preserve">Datas: Sessão, Validade da ATA, Previsão de Fechamento.</w:t>
+      </w:r>
+    </w:p>
+    <w:p>
+      <w:pPr>
+        <w:numPr>
+          <w:ilvl w:val="0"/>
+          <w:numId w:val="1"/>
+        </w:numPr>
+        <w:spacing w:after="40" w:before="40"/>
+      </w:pPr>
+      <w:r>
+        <w:rPr>
+          <w:rFonts w:ascii="Calibri" w:cs="Calibri" w:eastAsia="Calibri" w:hAnsi="Calibri"/>
+          <w:color w:val="1E293B"/>
+          <w:sz w:val="22"/>
+          <w:szCs w:val="22"/>
+        </w:rPr>
+        <w:t xml:space="preserve">Valor Registrado, Cliente, Estágio, Responsável.</w:t>
+      </w:r>
+    </w:p>
+    <w:p>
+      <w:pPr>
+        <w:numPr>
+          <w:ilvl w:val="0"/>
+          <w:numId w:val="1"/>
+        </w:numPr>
+        <w:spacing w:after="40" w:before="40"/>
+      </w:pPr>
+      <w:r>
+        <w:rPr>
+          <w:rFonts w:ascii="Calibri" w:cs="Calibri" w:eastAsia="Calibri" w:hAnsi="Calibri"/>
+          <w:color w:val="1E293B"/>
+          <w:sz w:val="22"/>
+          <w:szCs w:val="22"/>
+        </w:rPr>
+        <w:t xml:space="preserve">Contato, Nome do Contato, Próximo Contato.</w:t>
+      </w:r>
+    </w:p>
+    <w:p>
+      <w:pPr>
+        <w:spacing w:after="80" w:before="60"/>
+        <w:jc w:val="both"/>
+      </w:pPr>
+      <w:r>
+        <w:rPr>
+          <w:rFonts w:ascii="Calibri" w:cs="Calibri" w:eastAsia="Calibri" w:hAnsi="Calibri"/>
+          <w:color w:val="1E293B"/>
+          <w:sz w:val="22"/>
+          <w:szCs w:val="22"/>
+        </w:rPr>
+        <w:t xml:space="preserve">Clique em 💾 Salvar Alterações no rodapé esquerdo para persistir os dados.</w:t>
+      </w:r>
+    </w:p>
+    <w:p>
+      <w:pPr>
+        <w:spacing w:after="80" w:before="200"/>
+      </w:pPr>
+      <w:r>
+        <w:rPr>
+          <w:rFonts w:ascii="Calibri" w:cs="Calibri" w:eastAsia="Calibri" w:hAnsi="Calibri"/>
+          <w:b/>
+          <w:bCs/>
+          <w:color w:val="0369A1"/>
+          <w:sz w:val="24"/>
+          <w:szCs w:val="24"/>
+        </w:rPr>
+        <w:t xml:space="preserve">31.3 Painel Direito — 9 Abas de Documentos</w:t>
+      </w:r>
+    </w:p>
+    <w:p>
+      <w:pPr>
+        <w:spacing w:after="80" w:before="60"/>
+        <w:jc w:val="both"/>
+      </w:pPr>
+      <w:r>
+        <w:rPr>
+          <w:rFonts w:ascii="Calibri" w:cs="Calibri" w:eastAsia="Calibri" w:hAnsi="Calibri"/>
+          <w:color w:val="1E293B"/>
+          <w:sz w:val="22"/>
+          <w:szCs w:val="22"/>
+        </w:rPr>
+        <w:t xml:space="preserve">Ocupa 58% da tela. Organiza os documentos da oportunidade em 9 abas:</w:t>
+      </w:r>
+    </w:p>
+    <w:p>
+      <w:pPr>
+        <w:numPr>
+          <w:ilvl w:val="0"/>
+          <w:numId w:val="1"/>
+        </w:numPr>
+        <w:spacing w:after="40" w:before="40"/>
+      </w:pPr>
+      <w:r>
+        <w:rPr>
+          <w:rFonts w:ascii="Calibri" w:cs="Calibri" w:eastAsia="Calibri" w:hAnsi="Calibri"/>
+          <w:color w:val="1E293B"/>
+          <w:sz w:val="22"/>
+          <w:szCs w:val="22"/>
+        </w:rPr>
+        <w:t xml:space="preserve">📝 Andamento — registro de atualizações com @menções.</w:t>
+      </w:r>
+    </w:p>
+    <w:p>
+      <w:pPr>
+        <w:numPr>
+          <w:ilvl w:val="0"/>
+          <w:numId w:val="1"/>
+        </w:numPr>
+        <w:spacing w:after="40" w:before="40"/>
+      </w:pPr>
+      <w:r>
+        <w:rPr>
+          <w:rFonts w:ascii="Calibri" w:cs="Calibri" w:eastAsia="Calibri" w:hAnsi="Calibri"/>
+          <w:color w:val="1E293B"/>
+          <w:sz w:val="22"/>
+          <w:szCs w:val="22"/>
+        </w:rPr>
+        <w:t xml:space="preserve">📂 Processo — documentos do processo licitatório.</w:t>
+      </w:r>
+    </w:p>
+    <w:p>
+      <w:pPr>
+        <w:numPr>
+          <w:ilvl w:val="0"/>
+          <w:numId w:val="1"/>
+        </w:numPr>
+        <w:spacing w:after="40" w:before="40"/>
+      </w:pPr>
+      <w:r>
+        <w:rPr>
+          <w:rFonts w:ascii="Calibri" w:cs="Calibri" w:eastAsia="Calibri" w:hAnsi="Calibri"/>
+          <w:color w:val="1E293B"/>
+          <w:sz w:val="22"/>
+          <w:szCs w:val="22"/>
+        </w:rPr>
+        <w:t xml:space="preserve">⚠️ Impugnações — recursos e impugnações ao edital.</w:t>
+      </w:r>
+    </w:p>
+    <w:p>
+      <w:pPr>
+        <w:numPr>
+          <w:ilvl w:val="0"/>
+          <w:numId w:val="1"/>
+        </w:numPr>
+        <w:spacing w:after="40" w:before="40"/>
+      </w:pPr>
+      <w:r>
+        <w:rPr>
+          <w:rFonts w:ascii="Calibri" w:cs="Calibri" w:eastAsia="Calibri" w:hAnsi="Calibri"/>
+          <w:color w:val="1E293B"/>
+          <w:sz w:val="22"/>
+          <w:szCs w:val="22"/>
+        </w:rPr>
+        <w:t xml:space="preserve">📜 Recursos — recursos administrativos pós-sessão.</w:t>
+      </w:r>
+    </w:p>
+    <w:p>
+      <w:pPr>
+        <w:numPr>
+          <w:ilvl w:val="0"/>
+          <w:numId w:val="1"/>
+        </w:numPr>
+        <w:spacing w:after="40" w:before="40"/>
+      </w:pPr>
+      <w:r>
+        <w:rPr>
+          <w:rFonts w:ascii="Calibri" w:cs="Calibri" w:eastAsia="Calibri" w:hAnsi="Calibri"/>
+          <w:color w:val="1E293B"/>
+          <w:sz w:val="22"/>
+          <w:szCs w:val="22"/>
+        </w:rPr>
+        <w:t xml:space="preserve">📋 Contratos — contratos assinados.</w:t>
+      </w:r>
+    </w:p>
+    <w:p>
+      <w:pPr>
+        <w:numPr>
+          <w:ilvl w:val="0"/>
+          <w:numId w:val="1"/>
+        </w:numPr>
+        <w:spacing w:after="40" w:before="40"/>
+      </w:pPr>
+      <w:r>
+        <w:rPr>
+          <w:rFonts w:ascii="Calibri" w:cs="Calibri" w:eastAsia="Calibri" w:hAnsi="Calibri"/>
+          <w:color w:val="1E293B"/>
+          <w:sz w:val="22"/>
+          <w:szCs w:val="22"/>
+        </w:rPr>
+        <w:t xml:space="preserve">💰 Empenhos — notas de empenho e liquidação.</w:t>
+      </w:r>
+    </w:p>
+    <w:p>
+      <w:pPr>
+        <w:numPr>
+          <w:ilvl w:val="0"/>
+          <w:numId w:val="1"/>
+        </w:numPr>
+        <w:spacing w:after="40" w:before="40"/>
+      </w:pPr>
+      <w:r>
+        <w:rPr>
+          <w:rFonts w:ascii="Calibri" w:cs="Calibri" w:eastAsia="Calibri" w:hAnsi="Calibri"/>
+          <w:color w:val="1E293B"/>
+          <w:sz w:val="22"/>
+          <w:szCs w:val="22"/>
+        </w:rPr>
+        <w:t xml:space="preserve">📁 Doc Terceiros — documentos de parceiros e terceirizados.</w:t>
+      </w:r>
+    </w:p>
+    <w:p>
+      <w:pPr>
+        <w:numPr>
+          <w:ilvl w:val="0"/>
+          <w:numId w:val="1"/>
+        </w:numPr>
+        <w:spacing w:after="40" w:before="40"/>
+      </w:pPr>
+      <w:r>
+        <w:rPr>
+          <w:rFonts w:ascii="Calibri" w:cs="Calibri" w:eastAsia="Calibri" w:hAnsi="Calibri"/>
+          <w:color w:val="1E293B"/>
+          <w:sz w:val="22"/>
+          <w:szCs w:val="22"/>
+        </w:rPr>
+        <w:t xml:space="preserve">🔍 Prospecções — notas de prospecção e inteligência de mercado.</w:t>
+      </w:r>
+    </w:p>
+    <w:p>
+      <w:pPr>
+        <w:numPr>
+          <w:ilvl w:val="0"/>
+          <w:numId w:val="1"/>
+        </w:numPr>
+        <w:spacing w:after="40" w:before="40"/>
+      </w:pPr>
+      <w:r>
+        <w:rPr>
+          <w:rFonts w:ascii="Calibri" w:cs="Calibri" w:eastAsia="Calibri" w:hAnsi="Calibri"/>
+          <w:color w:val="1E293B"/>
+          <w:sz w:val="22"/>
+          <w:szCs w:val="22"/>
+        </w:rPr>
+        <w:t xml:space="preserve">🔬 Análise — análise orçamentária setorial (ver Cap. 21).</w:t>
+      </w:r>
+    </w:p>
+    <w:p>
+      <w:pPr>
+        <w:spacing w:after="80" w:before="60"/>
+        <w:jc w:val="both"/>
+      </w:pPr>
+      <w:r>
+        <w:rPr>
+          <w:rFonts w:ascii="Calibri" w:cs="Calibri" w:eastAsia="Calibri" w:hAnsi="Calibri"/>
+          <w:color w:val="1E293B"/>
+          <w:sz w:val="22"/>
+          <w:szCs w:val="22"/>
+        </w:rPr>
+        <w:t xml:space="preserve">Em cada aba (exceto Análise), é possível fazer upload de arquivos com legenda e visualizar/excluir os documentos já registrados.</w:t>
+      </w:r>
+    </w:p>
+    <w:p>
+      <w:pPr>
+        <w:spacing w:after="80" w:before="200"/>
+      </w:pPr>
+      <w:r>
+        <w:rPr>
+          <w:rFonts w:ascii="Calibri" w:cs="Calibri" w:eastAsia="Calibri" w:hAnsi="Calibri"/>
+          <w:b/>
+          <w:bCs/>
+          <w:color w:val="0369A1"/>
+          <w:sz w:val="24"/>
+          <w:szCs w:val="24"/>
+        </w:rPr>
+        <w:t xml:space="preserve">31.4 Área Livre — Editor de Texto Rico</w:t>
+      </w:r>
+    </w:p>
+    <w:p>
+      <w:pPr>
+        <w:spacing w:after="80" w:before="60"/>
+        <w:jc w:val="both"/>
+      </w:pPr>
+      <w:r>
+        <w:rPr>
+          <w:rFonts w:ascii="Calibri" w:cs="Calibri" w:eastAsia="Calibri" w:hAnsi="Calibri"/>
+          <w:color w:val="1E293B"/>
+          <w:sz w:val="22"/>
+          <w:szCs w:val="22"/>
+        </w:rPr>
+        <w:t xml:space="preserve">Abaixo das entradas de cada aba (exceto Análise), há a seção 📌 Área Livre: um editor de texto rico e persistente por aba e por oportunidade.</w:t>
+      </w:r>
+    </w:p>
+    <w:p>
+      <w:pPr>
+        <w:spacing w:after="80" w:before="60"/>
+        <w:jc w:val="both"/>
+      </w:pPr>
+      <w:r>
+        <w:rPr>
+          <w:rFonts w:ascii="Calibri" w:cs="Calibri" w:eastAsia="Calibri" w:hAnsi="Calibri"/>
+          <w:color w:val="1E293B"/>
+          <w:sz w:val="22"/>
+          <w:szCs w:val="22"/>
+        </w:rPr>
+        <w:t xml:space="preserve">Funcionalidades disponíveis na barra de ferramentas:</w:t>
+      </w:r>
+    </w:p>
+    <w:p>
+      <w:pPr>
+        <w:numPr>
+          <w:ilvl w:val="0"/>
+          <w:numId w:val="1"/>
+        </w:numPr>
+        <w:spacing w:after="40" w:before="40"/>
+      </w:pPr>
+      <w:r>
+        <w:rPr>
+          <w:rFonts w:ascii="Calibri" w:cs="Calibri" w:eastAsia="Calibri" w:hAnsi="Calibri"/>
+          <w:color w:val="1E293B"/>
+          <w:sz w:val="22"/>
+          <w:szCs w:val="22"/>
+        </w:rPr>
+        <w:t xml:space="preserve">B / I — formatar texto em negrito ou itálico.</w:t>
+      </w:r>
+    </w:p>
+    <w:p>
+      <w:pPr>
+        <w:numPr>
+          <w:ilvl w:val="0"/>
+          <w:numId w:val="1"/>
+        </w:numPr>
+        <w:spacing w:after="40" w:before="40"/>
+      </w:pPr>
+      <w:r>
+        <w:rPr>
+          <w:rFonts w:ascii="Calibri" w:cs="Calibri" w:eastAsia="Calibri" w:hAnsi="Calibri"/>
+          <w:color w:val="1E293B"/>
+          <w:sz w:val="22"/>
+          <w:szCs w:val="22"/>
+        </w:rPr>
+        <w:t xml:space="preserve">🔗 Link — inserir um hyperlink (abre um prompt para a URL).</w:t>
+      </w:r>
+    </w:p>
+    <w:p>
+      <w:pPr>
+        <w:numPr>
+          <w:ilvl w:val="0"/>
+          <w:numId w:val="1"/>
+        </w:numPr>
+        <w:spacing w:after="40" w:before="40"/>
+      </w:pPr>
+      <w:r>
+        <w:rPr>
+          <w:rFonts w:ascii="Calibri" w:cs="Calibri" w:eastAsia="Calibri" w:hAnsi="Calibri"/>
+          <w:color w:val="1E293B"/>
+          <w:sz w:val="22"/>
+          <w:szCs w:val="22"/>
+        </w:rPr>
+        <w:t xml:space="preserve">📷 Imagem — fazer upload de uma imagem do computador.</w:t>
+      </w:r>
+    </w:p>
+    <w:p>
+      <w:pPr>
+        <w:spacing w:after="80" w:before="60"/>
+        <w:jc w:val="both"/>
+      </w:pPr>
+      <w:r>
+        <w:rPr>
+          <w:rFonts w:ascii="Calibri" w:cs="Calibri" w:eastAsia="Calibri" w:hAnsi="Calibri"/>
+          <w:color w:val="1E293B"/>
+          <w:sz w:val="22"/>
+          <w:szCs w:val="22"/>
+        </w:rPr>
+        <w:t xml:space="preserve">Também é possível colar imagens diretamente da área de transferência (Ctrl+V) dentro do editor.</w:t>
+      </w:r>
+    </w:p>
+    <w:p>
+      <w:pPr>
+        <w:spacing w:after="80" w:before="60"/>
+        <w:jc w:val="both"/>
+      </w:pPr>
+      <w:r>
+        <w:rPr>
+          <w:rFonts w:ascii="Calibri" w:cs="Calibri" w:eastAsia="Calibri" w:hAnsi="Calibri"/>
+          <w:color w:val="1E293B"/>
+          <w:sz w:val="22"/>
+          <w:szCs w:val="22"/>
+        </w:rPr>
+        <w:t xml:space="preserve">Clique em 💾 Salvar Nota para persistir o conteúdo. O conteúdo é salvo individualmente por aba — cada aba tem sua própria Área Livre independente.</w:t>
+      </w:r>
+    </w:p>
+    <w:p>
+      <w:pPr>
+        <w:pBdr>
+          <w:left w:val="thick" w:color="22C55E" w:sz="12"/>
+        </w:pBdr>
+        <w:shd w:fill="F0FDF4" w:val="clear"/>
+        <w:spacing w:after="60" w:before="60"/>
+        <w:ind w:left="180"/>
+      </w:pPr>
+      <w:r>
+        <w:rPr>
+          <w:rFonts w:ascii="Calibri" w:cs="Calibri" w:eastAsia="Calibri" w:hAnsi="Calibri"/>
+          <w:i/>
+          <w:iCs/>
+          <w:color w:val="166534"/>
+          <w:sz w:val="20"/>
+          <w:szCs w:val="20"/>
+        </w:rPr>
+        <w:t xml:space="preserve">💡 Dica: Use a Área Livre para colar prints de tela, links de referência, mapas mentais colados como imagem, ou qualquer anotação rica que os campos estruturados não comportam.</w:t>
+      </w:r>
+    </w:p>
+    <w:p>
+      <w:pPr>
+        <w:spacing w:after="60" w:before="0"/>
+      </w:pPr>
     </w:p>
     <w:p>
       <w:pPr>

</xml_diff>

<commit_message>
docs: atualiza Manual e apresentacao com mudancas desde julho
Manual Word: reescreve status de Compras + capitulos 10.3-10.5 (Mesa de
Cotacoes, alcadas/departamento, conferencia tecnica/faturamento);
12.4 (responsaveis/apoios livres); 14.1 (Fretes); nota de OS veicular
no Fiscal (16); tabela e explicacao completa do fluxo de manutencao
veicular reformulado (18.2); 24.7 (departamentos/alcadas de compras);
link direto de mencoes (29.2); novo capitulo 32 (Aba Financeiro);
sumario atualizado com os capitulos 29-32. PDF regenerado a partir
do Word atualizado.

PPTX: 6 novos slides (40-45) cobrindo SAC veicular reformulado
(fluxo + CQ/Fiscal/entrega), Mesa de Cotacoes/aprovacoes, conferencia
tecnica/faturamento, Fretes e responsaveis/apoios livres -- inseridos
antes do slide de encerramento.

Co-Authored-By: Claude Sonnet 5 <noreply@anthropic.com>
</commit_message>
<xml_diff>
--- a/Manual_ACN_Sinal_Verde.docx
+++ b/Manual_ACN_Sinal_Verde.docx
@@ -810,6 +810,14 @@
     </w:p>
     <w:p>
       <w:pPr>
+        <w:pStyle w:val="ListParagraph"/>
+      </w:pPr>
+      <w:r>
+        <w:t xml:space="preserve">Menções em pedidos de compra e em Ordens de Serviço levam direto ao registro mencionado (não só à aba) — clique no texto da menção no painel de notificações para abrir o pedido/OS exato.</w:t>
+      </w:r>
+    </w:p>
+    <w:p>
+      <w:pPr>
         <w:tabs>
           <w:tab w:val="right" w:pos="8640" w:leader="dot"/>
         </w:tabs>
@@ -910,6 +918,110 @@
           <w:szCs w:val="20"/>
         </w:rPr>
         <w:t xml:space="preserve">	26</w:t>
+      </w:r>
+    </w:p>
+    <w:p>
+      <w:pPr>
+        <w:tabs>
+          <w:tab w:val="right" w:pos="8640" w:leader="dot"/>
+        </w:tabs>
+        <w:spacing w:after="30" w:before="30"/>
+      </w:pPr>
+      <w:r>
+        <w:rPr>
+          <w:rFonts w:ascii="Calibri" w:cs="Calibri" w:eastAsia="Calibri" w:hAnsi="Calibri"/>
+          <w:color w:val="1E293B"/>
+          <w:sz w:val="20"/>
+          <w:szCs w:val="20"/>
+        </w:rPr>
+        <w:t xml:space="preserve">29. Chat Interno e @Menções</w:t>
+      </w:r>
+      <w:r>
+        <w:rPr>
+          <w:rFonts w:ascii="Calibri" w:cs="Calibri" w:eastAsia="Calibri" w:hAnsi="Calibri"/>
+          <w:color w:val="475569"/>
+          <w:sz w:val="20"/>
+          <w:szCs w:val="20"/>
+        </w:rPr>
+        <w:t xml:space="preserve">	27</w:t>
+      </w:r>
+    </w:p>
+    <w:p>
+      <w:pPr>
+        <w:tabs>
+          <w:tab w:val="right" w:pos="8640" w:leader="dot"/>
+        </w:tabs>
+        <w:spacing w:after="30" w:before="30"/>
+      </w:pPr>
+      <w:r>
+        <w:rPr>
+          <w:rFonts w:ascii="Calibri" w:cs="Calibri" w:eastAsia="Calibri" w:hAnsi="Calibri"/>
+          <w:color w:val="1E293B"/>
+          <w:sz w:val="20"/>
+          <w:szCs w:val="20"/>
+        </w:rPr>
+        <w:t xml:space="preserve">30. Avisos do Sistema</w:t>
+      </w:r>
+      <w:r>
+        <w:rPr>
+          <w:rFonts w:ascii="Calibri" w:cs="Calibri" w:eastAsia="Calibri" w:hAnsi="Calibri"/>
+          <w:color w:val="475569"/>
+          <w:sz w:val="20"/>
+          <w:szCs w:val="20"/>
+        </w:rPr>
+        <w:t xml:space="preserve">	28</w:t>
+      </w:r>
+    </w:p>
+    <w:p>
+      <w:pPr>
+        <w:tabs>
+          <w:tab w:val="right" w:pos="8640" w:leader="dot"/>
+        </w:tabs>
+        <w:spacing w:after="30" w:before="30"/>
+      </w:pPr>
+      <w:r>
+        <w:rPr>
+          <w:rFonts w:ascii="Calibri" w:cs="Calibri" w:eastAsia="Calibri" w:hAnsi="Calibri"/>
+          <w:color w:val="1E293B"/>
+          <w:sz w:val="20"/>
+          <w:szCs w:val="20"/>
+        </w:rPr>
+        <w:t xml:space="preserve">31. CRM — Modal de Abertura e Área Livre</w:t>
+      </w:r>
+      <w:r>
+        <w:rPr>
+          <w:rFonts w:ascii="Calibri" w:cs="Calibri" w:eastAsia="Calibri" w:hAnsi="Calibri"/>
+          <w:color w:val="475569"/>
+          <w:sz w:val="20"/>
+          <w:szCs w:val="20"/>
+        </w:rPr>
+        <w:t xml:space="preserve">	29</w:t>
+      </w:r>
+    </w:p>
+    <w:p>
+      <w:pPr>
+        <w:tabs>
+          <w:tab w:val="right" w:pos="8640" w:leader="dot"/>
+        </w:tabs>
+        <w:spacing w:after="30" w:before="30"/>
+      </w:pPr>
+      <w:r>
+        <w:rPr>
+          <w:rFonts w:ascii="Calibri" w:cs="Calibri" w:eastAsia="Calibri" w:hAnsi="Calibri"/>
+          <w:color w:val="1E293B"/>
+          <w:sz w:val="20"/>
+          <w:szCs w:val="20"/>
+        </w:rPr>
+        <w:t xml:space="preserve">32. Aba Financeiro</w:t>
+      </w:r>
+      <w:r>
+        <w:rPr>
+          <w:rFonts w:ascii="Calibri" w:cs="Calibri" w:eastAsia="Calibri" w:hAnsi="Calibri"/>
+          <w:color w:val="475569"/>
+          <w:sz w:val="20"/>
+          <w:szCs w:val="20"/>
+        </w:rPr>
+        <w:t xml:space="preserve">	31</w:t>
       </w:r>
     </w:p>
     <w:p>
@@ -3710,7 +3822,7 @@
           <w:sz w:val="22"/>
           <w:szCs w:val="22"/>
         </w:rPr>
-        <w:t xml:space="preserve">Controle do status do pedido: Solicitado · Cotado · Aprovado · Pedido Realizado · Recebido.</w:t>
+        <w:t xml:space="preserve">Controle do status do pedido: Em Andamento · Aguardando Aprovação · Comprado · Concluído — a compra só fecha depois de escolhida a cotação vencedora na Mesa de Cotações (ver 10.3).</w:t>
       </w:r>
     </w:p>
     <w:p>
@@ -3820,6 +3932,140 @@
           <w:i/>
         </w:rPr>
         <w:t>💡 Dica: O relatório por Centro de Custo fica disponível na aba Relatórios &gt; Centro Custo, com totais por centro e drill-down de cada pedido.</w:t>
+      </w:r>
+    </w:p>
+    <w:p>
+      <w:r>
+        <w:rPr>
+          <w:b/>
+        </w:rPr>
+        <w:t xml:space="preserve">10.3 Mesa de Cotações</w:t>
+      </w:r>
+    </w:p>
+    <w:p>
+      <w:r>
+        <w:t xml:space="preserve">Para fechar uma compra, é obrigatório registrar pelo menos 3 cotações de fornecedores diferentes. Clique em 🏷️ Mesa de Cotações no pedido para abrir a tela de cotações.</w:t>
+      </w:r>
+    </w:p>
+    <w:p>
+      <w:pPr>
+        <w:pStyle w:val="ListParagraph"/>
+      </w:pPr>
+      <w:r>
+        <w:t xml:space="preserve">+ Nova Cotação de Fornecedor: registre fornecedor, valor, condição de pagamento, prazo de entrega e anexo (PDF ou imagem) de cada proposta recebida.</w:t>
+      </w:r>
+    </w:p>
+    <w:p>
+      <w:pPr>
+        <w:pStyle w:val="ListParagraph"/>
+      </w:pPr>
+      <w:r>
+        <w:t xml:space="preserve">✏️ Área Livre: cada cotação tem seu próprio espaço de anotação rica (texto, imagens coladas, tabelas) para registrar observações que ajudem na decisão.</w:t>
+      </w:r>
+    </w:p>
+    <w:p>
+      <w:pPr>
+        <w:pStyle w:val="ListParagraph"/>
+      </w:pPr>
+      <w:r>
+        <w:t xml:space="preserve">✅ Aprovar esta cotação como vencedora: disponível a partir de 3 cotações registradas e com o prazo de entrega preenchido. Pede a sua senha de login para confirmar a aprovação.</w:t>
+      </w:r>
+    </w:p>
+    <w:p>
+      <w:r>
+        <w:t xml:space="preserve">⚠ Nota: Só usuários autorizados (pelo nível de alçada ou pelo gestor do departamento vinculado ao pedido, ver 10.4) conseguem aprovar — o sistema bloqueia a tentativa com uma mensagem clara se você não for a pessoa certa.</w:t>
+      </w:r>
+    </w:p>
+    <w:p>
+      <w:r>
+        <w:rPr>
+          <w:b/>
+        </w:rPr>
+        <w:t xml:space="preserve">10.4 Aprovações — Alçadas e Departamento</w:t>
+      </w:r>
+    </w:p>
+    <w:p>
+      <w:r>
+        <w:t xml:space="preserve">Compras acima de determinado valor, ou vinculadas a um departamento específico, passam por uma etapa de aprovação antes de fechar.</w:t>
+      </w:r>
+    </w:p>
+    <w:p>
+      <w:pPr>
+        <w:pStyle w:val="ListParagraph"/>
+      </w:pPr>
+      <w:r>
+        <w:t xml:space="preserve">Alçada por valor: configurada em Admin &gt; Alçadas de Aprovação. Define, para cada faixa de valor, quais perfis podem aprovar (ver 24.7).</w:t>
+      </w:r>
+    </w:p>
+    <w:p>
+      <w:pPr>
+        <w:pStyle w:val="ListParagraph"/>
+      </w:pPr>
+      <w:r>
+        <w:t xml:space="preserve">🏢 Departamento: se o pedido tiver um departamento definido (coluna 🏢 Departamento na lista), o gestor daquele departamento é notificado assim que a 1ª cotação é lançada e precisa aprovar antes da compra fechar — em paralelo à alçada por valor, quando as duas se aplicam.</w:t>
+      </w:r>
+    </w:p>
+    <w:p>
+      <w:pPr>
+        <w:pStyle w:val="ListParagraph"/>
+      </w:pPr>
+      <w:r>
+        <w:t xml:space="preserve">Enquanto há aprovação pendente, a compra fica com status Aguardando Aprovação e um aviso 🔒 no topo da Mesa de Cotações mostra quem precisa aprovar.</w:t>
+      </w:r>
+    </w:p>
+    <w:p>
+      <w:pPr>
+        <w:pStyle w:val="ListParagraph"/>
+      </w:pPr>
+      <w:r>
+        <w:t xml:space="preserve">❌ Rejeitar: qualquer aprovador pode rejeitar com um motivo — a compra volta para Em Andamento e as aprovações pendentes são canceladas.</w:t>
+      </w:r>
+    </w:p>
+    <w:p>
+      <w:r>
+        <w:t xml:space="preserve">💡 Dica: A geração da Ordem de Compra (nº OC) é automática assim que a compra é aprovada/fechada — não é preciso preencher nada manualmente.</w:t>
+      </w:r>
+    </w:p>
+    <w:p>
+      <w:r>
+        <w:rPr>
+          <w:b/>
+        </w:rPr>
+        <w:t xml:space="preserve">10.5 Conferência Técnica e Faturamento</w:t>
+      </w:r>
+    </w:p>
+    <w:p>
+      <w:r>
+        <w:t xml:space="preserve">Depois que a compra fecha (status Comprado), o material segue para conferência na Logística antes do pagamento ser liberado.</w:t>
+      </w:r>
+    </w:p>
+    <w:p>
+      <w:pPr>
+        <w:pStyle w:val="ListParagraph"/>
+      </w:pPr>
+      <w:r>
+        <w:t xml:space="preserve">A Logística confere seriais, volume e a NF do fornecedor no manifesto de recebimento vinculado ao pedido.</w:t>
+      </w:r>
+    </w:p>
+    <w:p>
+      <w:pPr>
+        <w:pStyle w:val="ListParagraph"/>
+      </w:pPr>
+      <w:r>
+        <w:t xml:space="preserve">Só depois da conferência confirmada a compra é marcada como Concluído e libera o pagamento na aba Financeiro.</w:t>
+      </w:r>
+    </w:p>
+    <w:p>
+      <w:pPr>
+        <w:pStyle w:val="ListParagraph"/>
+      </w:pPr>
+      <w:r>
+        <w:t xml:space="preserve">Na aba Financeiro &gt; 📑 Faturamento de Compras, informe o número da NF do fornecedor, anexe o arquivo (opcional) e clique em 💰 Pago para concluir o ciclo (ver Capítulo 32).</w:t>
+      </w:r>
+    </w:p>
+    <w:p>
+      <w:r>
+        <w:t xml:space="preserve">💡 Dica: Depois de confirmada, a compra também gera automaticamente uma demanda em Demandas Gerais para acompanhamento de recebimento/logística.</w:t>
       </w:r>
     </w:p>
     <w:p>
@@ -4161,6 +4407,56 @@
           <w:i/>
         </w:rPr>
         <w:t>💡 Dica: O modo de execução impacta diretamente o cálculo de comissões na aba RH. Equipes dividem a comissão entre os membros conforme configuração do Head Line.</w:t>
+      </w:r>
+    </w:p>
+    <w:p>
+      <w:r>
+        <w:rPr>
+          <w:b/>
+        </w:rPr>
+        <w:t xml:space="preserve">12.4 Responsáveis e Apoios Livres</w:t>
+      </w:r>
+    </w:p>
+    <w:p>
+      <w:r>
+        <w:t xml:space="preserve">Depois que uma OP ou OS já foi iniciada, é possível ajustar quem está trabalhando nela sem precisar reabrir o modo de execução.</w:t>
+      </w:r>
+    </w:p>
+    <w:p>
+      <w:pPr>
+        <w:pStyle w:val="ListParagraph"/>
+      </w:pPr>
+      <w:r>
+        <w:t xml:space="preserve">Clique em 👥 EQUIPE na OP ou OS em produção para abrir o gerenciador.</w:t>
+      </w:r>
+    </w:p>
+    <w:p>
+      <w:pPr>
+        <w:pStyle w:val="ListParagraph"/>
+      </w:pPr>
+      <w:r>
+        <w:t xml:space="preserve">Responsáveis: recebem comissão pelo próprio percentual configurado em RH, como se tivessem sido atribuídos desde o início.</w:t>
+      </w:r>
+    </w:p>
+    <w:p>
+      <w:pPr>
+        <w:pStyle w:val="ListParagraph"/>
+      </w:pPr>
+      <w:r>
+        <w:t xml:space="preserve">Apoios: recebem um adicional fixo de 0,1% do valor de mão de obra daquela OP/OS, além do que os responsáveis já recebem — independente do percentual de comissão configurado para a pessoa.</w:t>
+      </w:r>
+    </w:p>
+    <w:p>
+      <w:pPr>
+        <w:pStyle w:val="ListParagraph"/>
+      </w:pPr>
+      <w:r>
+        <w:t xml:space="preserve">Use + Add para adicionar e 🗑️ para remover um membro a qualquer momento durante a execução.</w:t>
+      </w:r>
+    </w:p>
+    <w:p>
+      <w:r>
+        <w:t xml:space="preserve">💡 Dica: Essa lista é diferente do cadastro fixo de Equipes (12.2) — aqui você ajusta quem está creditado numa OP/OS específica, a qualquer momento, sem mexer no cadastro de equipes em si.</w:t>
       </w:r>
     </w:p>
     <w:p>
@@ -4478,6 +4774,59 @@
       </w:r>
     </w:p>
     <w:p>
+      <w:r>
+        <w:rPr>
+          <w:b/>
+        </w:rPr>
+        <w:t xml:space="preserve">14.1 Fretes</w:t>
+      </w:r>
+    </w:p>
+    <w:p>
+      <w:r>
+        <w:t xml:space="preserve">A sub-aba 🚚 Fretes controla a cotação e o acompanhamento de transportadoras, tanto para materiais chegando na ACN (📥 Inbound) quanto saindo (📤 Outbound).</w:t>
+      </w:r>
+    </w:p>
+    <w:p>
+      <w:pPr>
+        <w:pStyle w:val="ListParagraph"/>
+      </w:pPr>
+      <w:r>
+        <w:t xml:space="preserve">+ Novo Frete: registre descrição, origem, destino, data prevista e, se aplicável, vincule a um pedido de compra já comprado.</w:t>
+      </w:r>
+    </w:p>
+    <w:p>
+      <w:pPr>
+        <w:pStyle w:val="ListParagraph"/>
+      </w:pPr>
+      <w:r>
+        <w:t xml:space="preserve">🏷️ Cotações: registre pelo menos 3 cotações de transportadoras (transportadora, valor, condição de pagamento, prazo, anexo) — mesmo padrão de mínimo de 3 cotações usado em Compras.</w:t>
+      </w:r>
+    </w:p>
+    <w:p>
+      <w:pPr>
+        <w:pStyle w:val="ListParagraph"/>
+      </w:pPr>
+      <w:r>
+        <w:t xml:space="preserve">Escolha a cotação vencedora, preencha a justificativa e clique em ✅ Confirmar Transportadora — o frete passa para Em Trânsito.</w:t>
+      </w:r>
+    </w:p>
+    <w:p>
+      <w:pPr>
+        <w:pStyle w:val="ListParagraph"/>
+      </w:pPr>
+      <w:r>
+        <w:t xml:space="preserve">Ao chegar, anexe o canhoto (comprovante de entrega) — o botão ✅ Marcar como Entregue só fica habilitado depois que um arquivo é anexado.</w:t>
+      </w:r>
+    </w:p>
+    <w:p>
+      <w:pPr>
+        <w:pStyle w:val="ListParagraph"/>
+      </w:pPr>
+      <w:r>
+        <w:t xml:space="preserve">✕ Cancelar: disponível enquanto o frete está em Cotação ou Em Trânsito, pede um motivo.</w:t>
+      </w:r>
+    </w:p>
+    <w:p>
       <w:pPr>
         <w:pBdr>
           <w:bottom w:val="single" w:color="E2E8F0" w:sz="4"/>
@@ -4683,6 +5032,14 @@
           <w:szCs w:val="22"/>
         </w:rPr>
         <w:t xml:space="preserve">Controle de vouchers de serviço com itens e valores.</w:t>
+      </w:r>
+    </w:p>
+    <w:p>
+      <w:pPr>
+        <w:pStyle w:val="ListParagraph"/>
+      </w:pPr>
+      <w:r>
+        <w:t xml:space="preserve">Ordens de Serviço (OS) de manutenção veicular também passam pelo Fiscal: depois do checklist de qualidade aprovado, o SAC envia a OS com o número de série de cada item instalado, e o Fiscal emite a NF numa seção própria, do mesmo jeito que para uma OPL (ver Capítulo 18.2).</w:t>
       </w:r>
     </w:p>
     <w:p>
@@ -5707,7 +6064,7 @@
                 <w:sz w:val="20"/>
                 <w:szCs w:val="20"/>
               </w:rPr>
-              <w:t xml:space="preserve">Execução em andamento.</w:t>
+              <w:t xml:space="preserve">Execução em andamento. (Legado — novas OSs não usam mais este status; ver Em Execução abaixo.)</w:t>
             </w:r>
           </w:p>
         </w:tc>
@@ -5749,7 +6106,259 @@
                 <w:sz w:val="20"/>
                 <w:szCs w:val="20"/>
               </w:rPr>
-              <w:t xml:space="preserve">Serviço finalizado.</w:t>
+              <w:t xml:space="preserve">Serviço finalizado. (Legado — novas conclusões vão para Aguardando CQ.)</w:t>
+            </w:r>
+          </w:p>
+        </w:tc>
+      </w:tr>
+      <w:tr>
+        <w:tc>
+          <w:tcPr>
+            <w:tcW w:type="dxa" w:w="4550"/>
+            <w:shd w:fill="F1F5F9" w:val="clear"/>
+          </w:tcPr>
+          <w:p>
+            <w:pPr>
+              <w:spacing w:after="50" w:before="50"/>
+            </w:pPr>
+            <w:r>
+              <w:rPr>
+                <w:rFonts w:ascii="Calibri" w:cs="Calibri" w:eastAsia="Calibri" w:hAnsi="Calibri"/>
+                <w:color w:val="1E293B"/>
+                <w:sz w:val="20"/>
+                <w:szCs w:val="20"/>
+              </w:rPr>
+              <w:t xml:space="preserve">Em Execução</w:t>
+            </w:r>
+          </w:p>
+        </w:tc>
+        <w:tc>
+          <w:tcPr>
+            <w:tcW w:type="dxa" w:w="4550"/>
+            <w:shd w:fill="F1F5F9" w:val="clear"/>
+          </w:tcPr>
+          <w:p>
+            <w:pPr>
+              <w:spacing w:after="50" w:before="50"/>
+            </w:pPr>
+            <w:r>
+              <w:rPr>
+                <w:rFonts w:ascii="Calibri" w:cs="Calibri" w:eastAsia="Calibri" w:hAnsi="Calibri"/>
+                <w:color w:val="1E293B"/>
+                <w:sz w:val="20"/>
+                <w:szCs w:val="20"/>
+              </w:rPr>
+              <w:t xml:space="preserve">Técnico atribuído, serviço em andamento. Se Presencial, passou antes por Verificação e Orçamento; se Remota, já veio cotada.</w:t>
+            </w:r>
+          </w:p>
+        </w:tc>
+      </w:tr>
+      <w:tr>
+        <w:tc>
+          <w:tcPr>
+            <w:tcW w:type="dxa" w:w="4550"/>
+            <w:shd w:fill="FFFFFF" w:val="clear"/>
+          </w:tcPr>
+          <w:p>
+            <w:pPr>
+              <w:spacing w:after="50" w:before="50"/>
+            </w:pPr>
+            <w:r>
+              <w:rPr>
+                <w:rFonts w:ascii="Calibri" w:cs="Calibri" w:eastAsia="Calibri" w:hAnsi="Calibri"/>
+                <w:color w:val="1E293B"/>
+                <w:sz w:val="20"/>
+                <w:szCs w:val="20"/>
+              </w:rPr>
+              <w:t xml:space="preserve">Aguardando CQ</w:t>
+            </w:r>
+          </w:p>
+        </w:tc>
+        <w:tc>
+          <w:tcPr>
+            <w:tcW w:type="dxa" w:w="4550"/>
+            <w:shd w:fill="FFFFFF" w:val="clear"/>
+          </w:tcPr>
+          <w:p>
+            <w:pPr>
+              <w:spacing w:after="50" w:before="50"/>
+            </w:pPr>
+            <w:r>
+              <w:rPr>
+                <w:rFonts w:ascii="Calibri" w:cs="Calibri" w:eastAsia="Calibri" w:hAnsi="Calibri"/>
+                <w:color w:val="1E293B"/>
+                <w:sz w:val="20"/>
+                <w:szCs w:val="20"/>
+              </w:rPr>
+              <w:t xml:space="preserve">Itens conferidos batem com o orçamento aprovado — aguardando auditoria de qualidade (ver Capítulo 13). Se não baterem, a OS fica parada e o SAC recebe um alerta para negociar o novo valor com o cliente (botão 🔁 Resolver Revisão).</w:t>
+            </w:r>
+          </w:p>
+        </w:tc>
+      </w:tr>
+      <w:tr>
+        <w:tc>
+          <w:tcPr>
+            <w:tcW w:type="dxa" w:w="4550"/>
+            <w:shd w:fill="F1F5F9" w:val="clear"/>
+          </w:tcPr>
+          <w:p>
+            <w:pPr>
+              <w:spacing w:after="50" w:before="50"/>
+            </w:pPr>
+            <w:r>
+              <w:rPr>
+                <w:rFonts w:ascii="Calibri" w:cs="Calibri" w:eastAsia="Calibri" w:hAnsi="Calibri"/>
+                <w:color w:val="1E293B"/>
+                <w:sz w:val="20"/>
+                <w:szCs w:val="20"/>
+              </w:rPr>
+              <w:t xml:space="preserve">Aguardando Envio Fiscal</w:t>
+            </w:r>
+          </w:p>
+        </w:tc>
+        <w:tc>
+          <w:tcPr>
+            <w:tcW w:type="dxa" w:w="4550"/>
+            <w:shd w:fill="F1F5F9" w:val="clear"/>
+          </w:tcPr>
+          <w:p>
+            <w:pPr>
+              <w:spacing w:after="50" w:before="50"/>
+            </w:pPr>
+            <w:r>
+              <w:rPr>
+                <w:rFonts w:ascii="Calibri" w:cs="Calibri" w:eastAsia="Calibri" w:hAnsi="Calibri"/>
+                <w:color w:val="1E293B"/>
+                <w:sz w:val="20"/>
+                <w:szCs w:val="20"/>
+              </w:rPr>
+              <w:t xml:space="preserve">Checklist aprovado — o SAC precisa informar o número de série de cada item instalado antes de enviar ao Fiscal.</w:t>
+            </w:r>
+          </w:p>
+        </w:tc>
+      </w:tr>
+      <w:tr>
+        <w:tc>
+          <w:tcPr>
+            <w:tcW w:type="dxa" w:w="4550"/>
+            <w:shd w:fill="FFFFFF" w:val="clear"/>
+          </w:tcPr>
+          <w:p>
+            <w:pPr>
+              <w:spacing w:after="50" w:before="50"/>
+            </w:pPr>
+            <w:r>
+              <w:rPr>
+                <w:rFonts w:ascii="Calibri" w:cs="Calibri" w:eastAsia="Calibri" w:hAnsi="Calibri"/>
+                <w:color w:val="1E293B"/>
+                <w:sz w:val="20"/>
+                <w:szCs w:val="20"/>
+              </w:rPr>
+              <w:t xml:space="preserve">Aguardando Emissão NF</w:t>
+            </w:r>
+          </w:p>
+        </w:tc>
+        <w:tc>
+          <w:tcPr>
+            <w:tcW w:type="dxa" w:w="4550"/>
+            <w:shd w:fill="FFFFFF" w:val="clear"/>
+          </w:tcPr>
+          <w:p>
+            <w:pPr>
+              <w:spacing w:after="50" w:before="50"/>
+            </w:pPr>
+            <w:r>
+              <w:rPr>
+                <w:rFonts w:ascii="Calibri" w:cs="Calibri" w:eastAsia="Calibri" w:hAnsi="Calibri"/>
+                <w:color w:val="1E293B"/>
+                <w:sz w:val="20"/>
+                <w:szCs w:val="20"/>
+              </w:rPr>
+              <w:t xml:space="preserve">Fiscal aguardando emitir a Nota Fiscal.</w:t>
+            </w:r>
+          </w:p>
+        </w:tc>
+      </w:tr>
+      <w:tr>
+        <w:tc>
+          <w:tcPr>
+            <w:tcW w:type="dxa" w:w="4550"/>
+            <w:shd w:fill="F1F5F9" w:val="clear"/>
+          </w:tcPr>
+          <w:p>
+            <w:pPr>
+              <w:spacing w:after="50" w:before="50"/>
+            </w:pPr>
+            <w:r>
+              <w:rPr>
+                <w:rFonts w:ascii="Calibri" w:cs="Calibri" w:eastAsia="Calibri" w:hAnsi="Calibri"/>
+                <w:color w:val="1E293B"/>
+                <w:sz w:val="20"/>
+                <w:szCs w:val="20"/>
+              </w:rPr>
+              <w:t xml:space="preserve">Faturada - Aguardando Entrega</w:t>
+            </w:r>
+          </w:p>
+        </w:tc>
+        <w:tc>
+          <w:tcPr>
+            <w:tcW w:type="dxa" w:w="4550"/>
+            <w:shd w:fill="F1F5F9" w:val="clear"/>
+          </w:tcPr>
+          <w:p>
+            <w:pPr>
+              <w:spacing w:after="50" w:before="50"/>
+            </w:pPr>
+            <w:r>
+              <w:rPr>
+                <w:rFonts w:ascii="Calibri" w:cs="Calibri" w:eastAsia="Calibri" w:hAnsi="Calibri"/>
+                <w:color w:val="1E293B"/>
+                <w:sz w:val="20"/>
+                <w:szCs w:val="20"/>
+              </w:rPr>
+              <w:t xml:space="preserve">NF emitida — falta apenas registrar a entrega do veículo ao cliente (botão 🚚 Entrega).</w:t>
+            </w:r>
+          </w:p>
+        </w:tc>
+      </w:tr>
+      <w:tr>
+        <w:tc>
+          <w:tcPr>
+            <w:tcW w:type="dxa" w:w="4550"/>
+            <w:shd w:fill="FFFFFF" w:val="clear"/>
+          </w:tcPr>
+          <w:p>
+            <w:pPr>
+              <w:spacing w:after="50" w:before="50"/>
+            </w:pPr>
+            <w:r>
+              <w:rPr>
+                <w:rFonts w:ascii="Calibri" w:cs="Calibri" w:eastAsia="Calibri" w:hAnsi="Calibri"/>
+                <w:color w:val="1E293B"/>
+                <w:sz w:val="20"/>
+                <w:szCs w:val="20"/>
+              </w:rPr>
+              <w:t xml:space="preserve">Entregue</w:t>
+            </w:r>
+          </w:p>
+        </w:tc>
+        <w:tc>
+          <w:tcPr>
+            <w:tcW w:type="dxa" w:w="4550"/>
+            <w:shd w:fill="FFFFFF" w:val="clear"/>
+          </w:tcPr>
+          <w:p>
+            <w:pPr>
+              <w:spacing w:after="50" w:before="50"/>
+            </w:pPr>
+            <w:r>
+              <w:rPr>
+                <w:rFonts w:ascii="Calibri" w:cs="Calibri" w:eastAsia="Calibri" w:hAnsi="Calibri"/>
+                <w:color w:val="1E293B"/>
+                <w:sz w:val="20"/>
+                <w:szCs w:val="20"/>
+              </w:rPr>
+              <w:t xml:space="preserve">Veículo entregue ao cliente. Fim do fluxo.</w:t>
             </w:r>
           </w:p>
         </w:tc>
@@ -5761,6 +6370,55 @@
       </w:pPr>
       <w:r>
         <w:t xml:space="preserve"/>
+      </w:r>
+    </w:p>
+    <w:p>
+      <w:r>
+        <w:t xml:space="preserve">Toda OS veicular começa com o tipo definido na abertura: 📍 Presencial (o veículo vai até a ACN) ou 📡 Remota (a cotação é fechada antes de agendar, sem precisar do veículo ir à ACN antes).</w:t>
+      </w:r>
+    </w:p>
+    <w:p>
+      <w:pPr>
+        <w:pStyle w:val="ListParagraph"/>
+      </w:pPr>
+      <w:r>
+        <w:t xml:space="preserve">Presencial: o fluxo passa por Verificação e Orçamento só depois que o veículo chega (🚗 Chegou, na Adaptação).</w:t>
+      </w:r>
+    </w:p>
+    <w:p>
+      <w:pPr>
+        <w:pStyle w:val="ListParagraph"/>
+      </w:pPr>
+      <w:r>
+        <w:t xml:space="preserve">Remota: como já foi cotada, pula direto para Aguardando Início assim que o SAC confirma o aceite do cliente.</w:t>
+      </w:r>
+    </w:p>
+    <w:p>
+      <w:pPr>
+        <w:pStyle w:val="ListParagraph"/>
+      </w:pPr>
+      <w:r>
+        <w:t xml:space="preserve">A partir de Aguardando Início, os dois caminhos se unem: a Adaptação atribui o técnico responsável (▶️ Iniciar) para começar a execução.</w:t>
+      </w:r>
+    </w:p>
+    <w:p>
+      <w:r>
+        <w:t xml:space="preserve">Revisão de orçamento durante a execução: ao concluir (✅ Concluir), o sistema compara o total dos itens usados com o valor aprovado. Se bater, a OS segue para o Checklist de Qualidade. Se não bater, a OS fica parada no status atual e o SAC recebe um alerta para negociar o novo valor com o cliente — resolvido pelo botão 🔁 Resolver Revisão, que abre a edição do orçamento já preenchida com os novos itens e libera a Adaptação para concluir de novo.</w:t>
+      </w:r>
+    </w:p>
+    <w:p>
+      <w:r>
+        <w:t xml:space="preserve">Checklist de Qualidade: OSs em Aguardando CQ entram na fila da aba CQ &amp; Histórico numa seção própria (🔧 OS de Manutenção Veicular), com o mesmo checklist e assinatura digital usados para OPLs. Reprovada, a OS volta para Em Execução.</w:t>
+      </w:r>
+    </w:p>
+    <w:p>
+      <w:r>
+        <w:t xml:space="preserve">Fiscal: depois do CQ aprovado, o SAC informa o número de série de cada item instalado (📤 Enviar para Fiscal) e o Fiscal emite a NF numa seção própria da aba Fiscal, do mesmo jeito que para uma OPL.</w:t>
+      </w:r>
+    </w:p>
+    <w:p>
+      <w:r>
+        <w:t xml:space="preserve">⚠ Nota: Com a NF emitida, o botão 🚚 Entrega libera no SAC para registrar a retirada do veículo pelo cliente e concluir a OS.</w:t>
       </w:r>
     </w:p>
     <w:p>
@@ -10489,6 +11147,61 @@
     </w:p>
     <w:p>
       <w:pPr>
+        <w:pStyle w:val="3"/>
+        <w:spacing w:after="80" w:before="160"/>
+      </w:pPr>
+      <w:r>
+        <w:rPr>
+          <w:rFonts w:ascii="Calibri" w:cs="Calibri" w:eastAsia="Calibri" w:hAnsi="Calibri"/>
+          <w:b/>
+          <w:bCs/>
+          <w:color w:val="0D9488"/>
+          <w:sz w:val="24"/>
+          <w:szCs w:val="24"/>
+        </w:rPr>
+        <w:t xml:space="preserve">24.7 Departamentos e Alçadas de Compras</w:t>
+      </w:r>
+    </w:p>
+    <w:p>
+      <w:pPr>
+        <w:pStyle w:val="ListParagraph"/>
+        <w:numPr>
+          <w:ilvl w:val="0"/>
+          <w:numId w:val="1"/>
+        </w:numPr>
+        <w:spacing w:after="40" w:before="40"/>
+      </w:pPr>
+      <w:r>
+        <w:rPr>
+          <w:rFonts w:ascii="Calibri" w:cs="Calibri" w:eastAsia="Calibri" w:hAnsi="Calibri"/>
+          <w:color w:val="1E293B"/>
+          <w:sz w:val="22"/>
+          <w:szCs w:val="22"/>
+        </w:rPr>
+        <w:t xml:space="preserve">🏢 Departamentos (Compras): cadastre os departamentos que podem gerar pedidos de compra, cada um com um gestor responsável por aprovar as cotações vinculadas a ele.</w:t>
+      </w:r>
+    </w:p>
+    <w:p>
+      <w:pPr>
+        <w:pStyle w:val="ListParagraph"/>
+        <w:numPr>
+          <w:ilvl w:val="0"/>
+          <w:numId w:val="1"/>
+        </w:numPr>
+        <w:spacing w:after="40" w:before="40"/>
+      </w:pPr>
+      <w:r>
+        <w:rPr>
+          <w:rFonts w:ascii="Calibri" w:cs="Calibri" w:eastAsia="Calibri" w:hAnsi="Calibri"/>
+          <w:color w:val="1E293B"/>
+          <w:sz w:val="22"/>
+          <w:szCs w:val="22"/>
+        </w:rPr>
+        <w:t xml:space="preserve">✅ Alçadas de Aprovação: defina faixas de valor e quais perfis de usuário podem aprovar compras dentro de cada faixa.</w:t>
+      </w:r>
+    </w:p>
+    <w:p>
+      <w:pPr>
         <w:pBdr>
           <w:bottom w:val="single" w:color="E2E8F0" w:sz="4"/>
         </w:pBdr>
@@ -12948,6 +13661,231 @@
           <w:szCs w:val="20"/>
         </w:rPr>
         <w:t xml:space="preserve">💡 Dica: Use a Área Livre para colar prints de tela, links de referência, mapas mentais colados como imagem, ou qualquer anotação rica que os campos estruturados não comportam.</w:t>
+      </w:r>
+    </w:p>
+    <w:p>
+      <w:pPr>
+        <w:pBdr>
+          <w:bottom w:val="single" w:color="E2E8F0" w:sz="4"/>
+        </w:pBdr>
+        <w:spacing w:after="200" w:before="200"/>
+      </w:pPr>
+      <w:r>
+        <w:t xml:space="preserve"/>
+      </w:r>
+    </w:p>
+    <w:p>
+      <w:pPr>
+        <w:pStyle w:val="1"/>
+        <w:spacing w:after="160" w:before="300"/>
+      </w:pPr>
+      <w:r>
+        <w:rPr>
+          <w:rFonts w:ascii="Calibri" w:cs="Calibri" w:eastAsia="Calibri" w:hAnsi="Calibri"/>
+          <w:b/>
+          <w:bCs/>
+          <w:color w:val="1E3A5F"/>
+          <w:sz w:val="36"/>
+          <w:szCs w:val="36"/>
+        </w:rPr>
+        <w:t xml:space="preserve">32. Aba Financeiro</w:t>
+      </w:r>
+    </w:p>
+    <w:p>
+      <w:pPr>
+        <w:spacing w:after="80" w:before="60"/>
+        <w:jc w:val="both"/>
+      </w:pPr>
+      <w:r>
+        <w:rPr>
+          <w:rFonts w:ascii="Calibri" w:cs="Calibri" w:eastAsia="Calibri" w:hAnsi="Calibri"/>
+          <w:color w:val="1E293B"/>
+          <w:sz w:val="22"/>
+          <w:szCs w:val="22"/>
+        </w:rPr>
+        <w:t xml:space="preserve">A aba Financeiro controla o acompanhamento de gastos por Centro de Custo e o faturamento (pagamento) das compras já concluídas.</w:t>
+      </w:r>
+    </w:p>
+    <w:p>
+      <w:pPr>
+        <w:pStyle w:val="ListParagraph"/>
+        <w:numPr>
+          <w:ilvl w:val="0"/>
+          <w:numId w:val="1"/>
+        </w:numPr>
+        <w:spacing w:after="40" w:before="40"/>
+      </w:pPr>
+      <w:r>
+        <w:rPr>
+          <w:rFonts w:ascii="Calibri" w:cs="Calibri" w:eastAsia="Calibri" w:hAnsi="Calibri"/>
+          <w:color w:val="1E293B"/>
+          <w:sz w:val="22"/>
+          <w:szCs w:val="22"/>
+        </w:rPr>
+        <w:t xml:space="preserve">💰 Total Gasto · 🏷️ Centros Ativos · ✅ Concluídas · ⏳ Pendentes · ⚠️ Sem Centro: cards de resumo, filtráveis por mês/ano e por status.</w:t>
+      </w:r>
+    </w:p>
+    <w:p>
+      <w:pPr>
+        <w:pStyle w:val="ListParagraph"/>
+        <w:numPr>
+          <w:ilvl w:val="0"/>
+          <w:numId w:val="1"/>
+        </w:numPr>
+        <w:spacing w:after="40" w:before="40"/>
+      </w:pPr>
+      <w:r>
+        <w:rPr>
+          <w:rFonts w:ascii="Calibri" w:cs="Calibri" w:eastAsia="Calibri" w:hAnsi="Calibri"/>
+          <w:color w:val="1E293B"/>
+          <w:sz w:val="22"/>
+          <w:szCs w:val="22"/>
+        </w:rPr>
+        <w:t xml:space="preserve">📊 Despesas por Centro de Custo: gráfico comparativo entre os centros.</w:t>
+      </w:r>
+    </w:p>
+    <w:p>
+      <w:pPr>
+        <w:pStyle w:val="ListParagraph"/>
+        <w:numPr>
+          <w:ilvl w:val="0"/>
+          <w:numId w:val="1"/>
+        </w:numPr>
+        <w:spacing w:after="40" w:before="40"/>
+      </w:pPr>
+      <w:r>
+        <w:rPr>
+          <w:rFonts w:ascii="Calibri" w:cs="Calibri" w:eastAsia="Calibri" w:hAnsi="Calibri"/>
+          <w:color w:val="1E293B"/>
+          <w:sz w:val="22"/>
+          <w:szCs w:val="22"/>
+        </w:rPr>
+        <w:t xml:space="preserve">🗂️ Consolidado por Centro de Custo: tabela com total gasto e quantidade de compras por centro; clique em Ver para abrir o detalhe de cada pedido daquele centro, com opção de imprimir a Ordem de Compra (🖨️).</w:t>
+      </w:r>
+    </w:p>
+    <w:p>
+      <w:pPr>
+        <w:pStyle w:val="3"/>
+        <w:spacing w:after="80" w:before="160"/>
+      </w:pPr>
+      <w:r>
+        <w:rPr>
+          <w:rFonts w:ascii="Calibri" w:cs="Calibri" w:eastAsia="Calibri" w:hAnsi="Calibri"/>
+          <w:b/>
+          <w:bCs/>
+          <w:color w:val="0D9488"/>
+          <w:sz w:val="24"/>
+          <w:szCs w:val="24"/>
+        </w:rPr>
+        <w:t xml:space="preserve">32.1 Faturamento de Compras</w:t>
+      </w:r>
+    </w:p>
+    <w:p>
+      <w:pPr>
+        <w:pStyle w:val="ListParagraph"/>
+        <w:numPr>
+          <w:ilvl w:val="0"/>
+          <w:numId w:val="1"/>
+        </w:numPr>
+        <w:spacing w:after="40" w:before="40"/>
+      </w:pPr>
+      <w:r>
+        <w:rPr>
+          <w:rFonts w:ascii="Calibri" w:cs="Calibri" w:eastAsia="Calibri" w:hAnsi="Calibri"/>
+          <w:color w:val="1E293B"/>
+          <w:sz w:val="22"/>
+          <w:szCs w:val="22"/>
+        </w:rPr>
+        <w:t xml:space="preserve">Lista as compras já Concluídas na Logística, aguardando o pagamento ao fornecedor.</w:t>
+      </w:r>
+    </w:p>
+    <w:p>
+      <w:pPr>
+        <w:pStyle w:val="ListParagraph"/>
+        <w:numPr>
+          <w:ilvl w:val="0"/>
+          <w:numId w:val="1"/>
+        </w:numPr>
+        <w:spacing w:after="40" w:before="40"/>
+      </w:pPr>
+      <w:r>
+        <w:rPr>
+          <w:rFonts w:ascii="Calibri" w:cs="Calibri" w:eastAsia="Calibri" w:hAnsi="Calibri"/>
+          <w:color w:val="1E293B"/>
+          <w:sz w:val="22"/>
+          <w:szCs w:val="22"/>
+        </w:rPr>
+        <w:t xml:space="preserve">Status: 🔒 Aguardando recebimento (a Logística ainda não confirmou o recebimento) · 🔓 Liberado p/ pagamento · ✅ Pago.</w:t>
+      </w:r>
+    </w:p>
+    <w:p>
+      <w:pPr>
+        <w:pStyle w:val="ListParagraph"/>
+        <w:numPr>
+          <w:ilvl w:val="0"/>
+          <w:numId w:val="1"/>
+        </w:numPr>
+        <w:spacing w:after="40" w:before="40"/>
+      </w:pPr>
+      <w:r>
+        <w:rPr>
+          <w:rFonts w:ascii="Calibri" w:cs="Calibri" w:eastAsia="Calibri" w:hAnsi="Calibri"/>
+          <w:color w:val="1E293B"/>
+          <w:sz w:val="22"/>
+          <w:szCs w:val="22"/>
+        </w:rPr>
+        <w:t xml:space="preserve">Para dar baixa: informe o Nº NF fornecedor, anexe o arquivo da nota (opcional) e clique em 💰 Pago.</w:t>
+      </w:r>
+    </w:p>
+    <w:p>
+      <w:pPr>
+        <w:pStyle w:val="3"/>
+        <w:spacing w:after="80" w:before="160"/>
+      </w:pPr>
+      <w:r>
+        <w:rPr>
+          <w:rFonts w:ascii="Calibri" w:cs="Calibri" w:eastAsia="Calibri" w:hAnsi="Calibri"/>
+          <w:b/>
+          <w:bCs/>
+          <w:color w:val="0D9488"/>
+          <w:sz w:val="24"/>
+          <w:szCs w:val="24"/>
+        </w:rPr>
+        <w:t xml:space="preserve">32.2 Gerenciar Centros de Custo</w:t>
+      </w:r>
+    </w:p>
+    <w:p>
+      <w:pPr>
+        <w:pStyle w:val="ListParagraph"/>
+        <w:numPr>
+          <w:ilvl w:val="0"/>
+          <w:numId w:val="1"/>
+        </w:numPr>
+        <w:spacing w:after="40" w:before="40"/>
+      </w:pPr>
+      <w:r>
+        <w:rPr>
+          <w:rFonts w:ascii="Calibri" w:cs="Calibri" w:eastAsia="Calibri" w:hAnsi="Calibri"/>
+          <w:color w:val="1E293B"/>
+          <w:sz w:val="22"/>
+          <w:szCs w:val="22"/>
+        </w:rPr>
+        <w:t xml:space="preserve">Botão 🏷️ Gerenciar Centros (Admin/Gerente/Compras): cria novos centros (código + nome) e ativa/desativa os existentes.</w:t>
+      </w:r>
+    </w:p>
+    <w:p>
+      <w:pPr>
+        <w:spacing w:after="80" w:before="60"/>
+        <w:jc w:val="both"/>
+      </w:pPr>
+      <w:r>
+        <w:rPr>
+          <w:rFonts w:ascii="Calibri" w:cs="Calibri" w:eastAsia="Calibri" w:hAnsi="Calibri"/>
+          <w:color w:val="1E293B"/>
+          <w:sz w:val="22"/>
+          <w:szCs w:val="22"/>
+        </w:rPr>
+        <w:t xml:space="preserve">💡 Dica: Esse cadastro de centros é o mesmo usado na aba Compras (10.1/10.2) e no relatório da aba Relatórios &gt; Centro Custo (23.1).</w:t>
       </w:r>
     </w:p>
     <w:p>

</xml_diff>